<commit_message>
workbuddy phase-8.1 jobs v3: complete Word report with commands log and grep verification
</commit_message>
<xml_diff>
--- a/docs/self-checks/Phase_8.1_Jobs_v3_自检报告.docx
+++ b/docs/self-checks/Phase_8.1_Jobs_v3_自检报告.docx
@@ -13,7 +13,7 @@
     </w:p>
     <w:p>
       <w:r>
-        <w:t>生成日期：2026-06-27 12:48</w:t>
+        <w:t>生成日期：2026-06-27 12:51</w:t>
       </w:r>
     </w:p>
     <w:p>
@@ -2587,7 +2587,705 @@
         <w:pStyle w:val="Heading1"/>
       </w:pPr>
       <w:r>
-        <w:t>七、验收红线确认</w:t>
+        <w:t>七、Commands Log &amp; Grep 验证</w:t>
+      </w:r>
+    </w:p>
+    <w:p>
+      <w:pPr>
+        <w:pStyle w:val="Heading2"/>
+      </w:pPr>
+      <w:r>
+        <w:t>7.1 构建命令</w:t>
+      </w:r>
+    </w:p>
+    <w:tbl>
+      <w:tblPr>
+        <w:tblStyle w:val="TableGrid"/>
+        <w:tblW w:type="auto" w:w="0"/>
+        <w:jc w:val="center"/>
+        <w:tblLook w:firstColumn="1" w:firstRow="1" w:lastColumn="0" w:lastRow="0" w:noHBand="0" w:noVBand="1" w:val="04A0"/>
+      </w:tblPr>
+      <w:tblGrid>
+        <w:gridCol w:w="4320"/>
+        <w:gridCol w:w="4320"/>
+      </w:tblGrid>
+      <w:tr>
+        <w:tc>
+          <w:tcPr>
+            <w:tcW w:type="dxa" w:w="4320"/>
+            <w:shd w:val="clear" w:color="auto" w:fill="2B579A"/>
+          </w:tcPr>
+          <w:p>
+            <w:pPr>
+              <w:jc w:val="center"/>
+            </w:pPr>
+            <w:r>
+              <w:rPr>
+                <w:b/>
+                <w:color w:val="FFFFFF"/>
+                <w:sz w:val="20"/>
+              </w:rPr>
+              <w:t>命令</w:t>
+            </w:r>
+          </w:p>
+        </w:tc>
+        <w:tc>
+          <w:tcPr>
+            <w:tcW w:type="dxa" w:w="4320"/>
+            <w:shd w:val="clear" w:color="auto" w:fill="2B579A"/>
+          </w:tcPr>
+          <w:p>
+            <w:pPr>
+              <w:jc w:val="center"/>
+            </w:pPr>
+            <w:r>
+              <w:rPr>
+                <w:b/>
+                <w:color w:val="FFFFFF"/>
+                <w:sz w:val="20"/>
+              </w:rPr>
+              <w:t>结果</w:t>
+            </w:r>
+          </w:p>
+        </w:tc>
+      </w:tr>
+      <w:tr>
+        <w:tc>
+          <w:tcPr>
+            <w:tcW w:type="dxa" w:w="4320"/>
+            <w:shd w:val="clear" w:color="auto" w:fill="F2F6FC"/>
+          </w:tcPr>
+          <w:p>
+            <w:r>
+              <w:rPr>
+                <w:sz w:val="18"/>
+              </w:rPr>
+              <w:t>pnpm prisma generate</w:t>
+            </w:r>
+          </w:p>
+        </w:tc>
+        <w:tc>
+          <w:tcPr>
+            <w:tcW w:type="dxa" w:w="4320"/>
+            <w:shd w:val="clear" w:color="auto" w:fill="F2F6FC"/>
+          </w:tcPr>
+          <w:p>
+            <w:r>
+              <w:rPr>
+                <w:sz w:val="18"/>
+              </w:rPr>
+              <w:t>✅ Prisma Client v7.8.0</w:t>
+            </w:r>
+          </w:p>
+        </w:tc>
+      </w:tr>
+      <w:tr>
+        <w:tc>
+          <w:tcPr>
+            <w:tcW w:type="dxa" w:w="4320"/>
+          </w:tcPr>
+          <w:p>
+            <w:r>
+              <w:rPr>
+                <w:sz w:val="18"/>
+              </w:rPr>
+              <w:t>pnpm typecheck</w:t>
+            </w:r>
+          </w:p>
+        </w:tc>
+        <w:tc>
+          <w:tcPr>
+            <w:tcW w:type="dxa" w:w="4320"/>
+          </w:tcPr>
+          <w:p>
+            <w:r>
+              <w:rPr>
+                <w:sz w:val="18"/>
+              </w:rPr>
+              <w:t>✅ PASS (0 errors)</w:t>
+            </w:r>
+          </w:p>
+        </w:tc>
+      </w:tr>
+      <w:tr>
+        <w:tc>
+          <w:tcPr>
+            <w:tcW w:type="dxa" w:w="4320"/>
+            <w:shd w:val="clear" w:color="auto" w:fill="F2F6FC"/>
+          </w:tcPr>
+          <w:p>
+            <w:r>
+              <w:rPr>
+                <w:sz w:val="18"/>
+              </w:rPr>
+              <w:t>pnpm lint</w:t>
+            </w:r>
+          </w:p>
+        </w:tc>
+        <w:tc>
+          <w:tcPr>
+            <w:tcW w:type="dxa" w:w="4320"/>
+            <w:shd w:val="clear" w:color="auto" w:fill="F2F6FC"/>
+          </w:tcPr>
+          <w:p>
+            <w:r>
+              <w:rPr>
+                <w:sz w:val="18"/>
+              </w:rPr>
+              <w:t>✅ PASS (0 errors)</w:t>
+            </w:r>
+          </w:p>
+        </w:tc>
+      </w:tr>
+      <w:tr>
+        <w:tc>
+          <w:tcPr>
+            <w:tcW w:type="dxa" w:w="4320"/>
+          </w:tcPr>
+          <w:p>
+            <w:r>
+              <w:rPr>
+                <w:sz w:val="18"/>
+              </w:rPr>
+              <w:t>pnpm build</w:t>
+            </w:r>
+          </w:p>
+        </w:tc>
+        <w:tc>
+          <w:tcPr>
+            <w:tcW w:type="dxa" w:w="4320"/>
+          </w:tcPr>
+          <w:p>
+            <w:r>
+              <w:rPr>
+                <w:sz w:val="18"/>
+              </w:rPr>
+              <w:t>✅ PASS (全部路由编译)</w:t>
+            </w:r>
+          </w:p>
+        </w:tc>
+      </w:tr>
+    </w:tbl>
+    <w:p/>
+    <w:p>
+      <w:pPr>
+        <w:pStyle w:val="Heading2"/>
+      </w:pPr>
+      <w:r>
+        <w:t>7.2 Git 状态</w:t>
+      </w:r>
+    </w:p>
+    <w:tbl>
+      <w:tblPr>
+        <w:tblStyle w:val="TableGrid"/>
+        <w:tblW w:type="auto" w:w="0"/>
+        <w:jc w:val="center"/>
+        <w:tblLook w:firstColumn="1" w:firstRow="1" w:lastColumn="0" w:lastRow="0" w:noHBand="0" w:noVBand="1" w:val="04A0"/>
+      </w:tblPr>
+      <w:tblGrid>
+        <w:gridCol w:w="4320"/>
+        <w:gridCol w:w="4320"/>
+      </w:tblGrid>
+      <w:tr>
+        <w:tc>
+          <w:tcPr>
+            <w:tcW w:type="dxa" w:w="4320"/>
+            <w:shd w:val="clear" w:color="auto" w:fill="2B579A"/>
+          </w:tcPr>
+          <w:p>
+            <w:pPr>
+              <w:jc w:val="center"/>
+            </w:pPr>
+            <w:r>
+              <w:rPr>
+                <w:b/>
+                <w:color w:val="FFFFFF"/>
+                <w:sz w:val="20"/>
+              </w:rPr>
+              <w:t>命令</w:t>
+            </w:r>
+          </w:p>
+        </w:tc>
+        <w:tc>
+          <w:tcPr>
+            <w:tcW w:type="dxa" w:w="4320"/>
+            <w:shd w:val="clear" w:color="auto" w:fill="2B579A"/>
+          </w:tcPr>
+          <w:p>
+            <w:pPr>
+              <w:jc w:val="center"/>
+            </w:pPr>
+            <w:r>
+              <w:rPr>
+                <w:b/>
+                <w:color w:val="FFFFFF"/>
+                <w:sz w:val="20"/>
+              </w:rPr>
+              <w:t>结果</w:t>
+            </w:r>
+          </w:p>
+        </w:tc>
+      </w:tr>
+      <w:tr>
+        <w:tc>
+          <w:tcPr>
+            <w:tcW w:type="dxa" w:w="4320"/>
+            <w:shd w:val="clear" w:color="auto" w:fill="F2F6FC"/>
+          </w:tcPr>
+          <w:p>
+            <w:r>
+              <w:rPr>
+                <w:sz w:val="18"/>
+              </w:rPr>
+              <w:t>git status --short</w:t>
+            </w:r>
+          </w:p>
+        </w:tc>
+        <w:tc>
+          <w:tcPr>
+            <w:tcW w:type="dxa" w:w="4320"/>
+            <w:shd w:val="clear" w:color="auto" w:fill="F2F6FC"/>
+          </w:tcPr>
+          <w:p>
+            <w:r>
+              <w:rPr>
+                <w:sz w:val="18"/>
+              </w:rPr>
+              <w:t>✅ clean</w:t>
+            </w:r>
+          </w:p>
+        </w:tc>
+      </w:tr>
+      <w:tr>
+        <w:tc>
+          <w:tcPr>
+            <w:tcW w:type="dxa" w:w="4320"/>
+          </w:tcPr>
+          <w:p>
+            <w:r>
+              <w:rPr>
+                <w:sz w:val="18"/>
+              </w:rPr>
+              <w:t>git branch --show-current</w:t>
+            </w:r>
+          </w:p>
+        </w:tc>
+        <w:tc>
+          <w:tcPr>
+            <w:tcW w:type="dxa" w:w="4320"/>
+          </w:tcPr>
+          <w:p>
+            <w:r>
+              <w:rPr>
+                <w:sz w:val="18"/>
+              </w:rPr>
+              <w:t>agent/workbuddy/phase-7</w:t>
+            </w:r>
+          </w:p>
+        </w:tc>
+      </w:tr>
+      <w:tr>
+        <w:tc>
+          <w:tcPr>
+            <w:tcW w:type="dxa" w:w="4320"/>
+            <w:shd w:val="clear" w:color="auto" w:fill="F2F6FC"/>
+          </w:tcPr>
+          <w:p>
+            <w:r>
+              <w:rPr>
+                <w:sz w:val="18"/>
+              </w:rPr>
+              <w:t>是否合并 main</w:t>
+            </w:r>
+          </w:p>
+        </w:tc>
+        <w:tc>
+          <w:tcPr>
+            <w:tcW w:type="dxa" w:w="4320"/>
+            <w:shd w:val="clear" w:color="auto" w:fill="F2F6FC"/>
+          </w:tcPr>
+          <w:p>
+            <w:r>
+              <w:rPr>
+                <w:sz w:val="18"/>
+              </w:rPr>
+              <w:t>否</w:t>
+            </w:r>
+          </w:p>
+        </w:tc>
+      </w:tr>
+      <w:tr>
+        <w:tc>
+          <w:tcPr>
+            <w:tcW w:type="dxa" w:w="4320"/>
+          </w:tcPr>
+          <w:p>
+            <w:r>
+              <w:rPr>
+                <w:sz w:val="18"/>
+              </w:rPr>
+              <w:t>是否 force push</w:t>
+            </w:r>
+          </w:p>
+        </w:tc>
+        <w:tc>
+          <w:tcPr>
+            <w:tcW w:type="dxa" w:w="4320"/>
+          </w:tcPr>
+          <w:p>
+            <w:r>
+              <w:rPr>
+                <w:sz w:val="18"/>
+              </w:rPr>
+              <w:t>否</w:t>
+            </w:r>
+          </w:p>
+        </w:tc>
+      </w:tr>
+    </w:tbl>
+    <w:p/>
+    <w:p>
+      <w:pPr>
+        <w:pStyle w:val="Heading2"/>
+      </w:pPr>
+      <w:r>
+        <w:t>7.3 代码质量 Grep</w:t>
+      </w:r>
+    </w:p>
+    <w:tbl>
+      <w:tblPr>
+        <w:tblStyle w:val="TableGrid"/>
+        <w:tblW w:type="auto" w:w="0"/>
+        <w:jc w:val="center"/>
+        <w:tblLook w:firstColumn="1" w:firstRow="1" w:lastColumn="0" w:lastRow="0" w:noHBand="0" w:noVBand="1" w:val="04A0"/>
+      </w:tblPr>
+      <w:tblGrid>
+        <w:gridCol w:w="2880"/>
+        <w:gridCol w:w="2880"/>
+        <w:gridCol w:w="2880"/>
+      </w:tblGrid>
+      <w:tr>
+        <w:tc>
+          <w:tcPr>
+            <w:tcW w:type="dxa" w:w="2880"/>
+            <w:shd w:val="clear" w:color="auto" w:fill="2B579A"/>
+          </w:tcPr>
+          <w:p>
+            <w:pPr>
+              <w:jc w:val="center"/>
+            </w:pPr>
+            <w:r>
+              <w:rPr>
+                <w:b/>
+                <w:color w:val="FFFFFF"/>
+                <w:sz w:val="20"/>
+              </w:rPr>
+              <w:t>检查项</w:t>
+            </w:r>
+          </w:p>
+        </w:tc>
+        <w:tc>
+          <w:tcPr>
+            <w:tcW w:type="dxa" w:w="2880"/>
+            <w:shd w:val="clear" w:color="auto" w:fill="2B579A"/>
+          </w:tcPr>
+          <w:p>
+            <w:pPr>
+              <w:jc w:val="center"/>
+            </w:pPr>
+            <w:r>
+              <w:rPr>
+                <w:b/>
+                <w:color w:val="FFFFFF"/>
+                <w:sz w:val="20"/>
+              </w:rPr>
+              <w:t>结果</w:t>
+            </w:r>
+          </w:p>
+        </w:tc>
+        <w:tc>
+          <w:tcPr>
+            <w:tcW w:type="dxa" w:w="2880"/>
+            <w:shd w:val="clear" w:color="auto" w:fill="2B579A"/>
+          </w:tcPr>
+          <w:p>
+            <w:pPr>
+              <w:jc w:val="center"/>
+            </w:pPr>
+            <w:r>
+              <w:rPr>
+                <w:b/>
+                <w:color w:val="FFFFFF"/>
+                <w:sz w:val="20"/>
+              </w:rPr>
+              <w:t>说明</w:t>
+            </w:r>
+          </w:p>
+        </w:tc>
+      </w:tr>
+      <w:tr>
+        <w:tc>
+          <w:tcPr>
+            <w:tcW w:type="dxa" w:w="2880"/>
+            <w:shd w:val="clear" w:color="auto" w:fill="F2F6FC"/>
+          </w:tcPr>
+          <w:p>
+            <w:r>
+              <w:rPr>
+                <w:sz w:val="18"/>
+              </w:rPr>
+              <w:t>AI 决策看板 / AI 决策</w:t>
+            </w:r>
+          </w:p>
+        </w:tc>
+        <w:tc>
+          <w:tcPr>
+            <w:tcW w:type="dxa" w:w="2880"/>
+            <w:shd w:val="clear" w:color="auto" w:fill="F2F6FC"/>
+          </w:tcPr>
+          <w:p>
+            <w:r>
+              <w:rPr>
+                <w:sz w:val="18"/>
+              </w:rPr>
+              <w:t>✅ 已清零</w:t>
+            </w:r>
+          </w:p>
+        </w:tc>
+        <w:tc>
+          <w:tcPr>
+            <w:tcW w:type="dxa" w:w="2880"/>
+            <w:shd w:val="clear" w:color="auto" w:fill="F2F6FC"/>
+          </w:tcPr>
+          <w:p>
+            <w:r>
+              <w:rPr>
+                <w:sz w:val="18"/>
+              </w:rPr>
+              <w:t>app/components/server 中无</w:t>
+            </w:r>
+          </w:p>
+        </w:tc>
+      </w:tr>
+      <w:tr>
+        <w:tc>
+          <w:tcPr>
+            <w:tcW w:type="dxa" w:w="2880"/>
+          </w:tcPr>
+          <w:p>
+            <w:r>
+              <w:rPr>
+                <w:sz w:val="18"/>
+              </w:rPr>
+              <w:t>自主智能 / 自动决策</w:t>
+            </w:r>
+          </w:p>
+        </w:tc>
+        <w:tc>
+          <w:tcPr>
+            <w:tcW w:type="dxa" w:w="2880"/>
+          </w:tcPr>
+          <w:p>
+            <w:r>
+              <w:rPr>
+                <w:sz w:val="18"/>
+              </w:rPr>
+              <w:t>✅ 已清零</w:t>
+            </w:r>
+          </w:p>
+        </w:tc>
+        <w:tc>
+          <w:tcPr>
+            <w:tcW w:type="dxa" w:w="2880"/>
+          </w:tcPr>
+          <w:p>
+            <w:r>
+              <w:rPr>
+                <w:sz w:val="18"/>
+              </w:rPr>
+              <w:t>仅在禁止列表中作为反例</w:t>
+            </w:r>
+          </w:p>
+        </w:tc>
+      </w:tr>
+      <w:tr>
+        <w:tc>
+          <w:tcPr>
+            <w:tcW w:type="dxa" w:w="2880"/>
+            <w:shd w:val="clear" w:color="auto" w:fill="F2F6FC"/>
+          </w:tcPr>
+          <w:p>
+            <w:r>
+              <w:rPr>
+                <w:sz w:val="18"/>
+              </w:rPr>
+              <w:t>mock/test/demo 命名</w:t>
+            </w:r>
+          </w:p>
+        </w:tc>
+        <w:tc>
+          <w:tcPr>
+            <w:tcW w:type="dxa" w:w="2880"/>
+            <w:shd w:val="clear" w:color="auto" w:fill="F2F6FC"/>
+          </w:tcPr>
+          <w:p>
+            <w:r>
+              <w:rPr>
+                <w:sz w:val="18"/>
+              </w:rPr>
+              <w:t>✅ 已清零</w:t>
+            </w:r>
+          </w:p>
+        </w:tc>
+        <w:tc>
+          <w:tcPr>
+            <w:tcW w:type="dxa" w:w="2880"/>
+            <w:shd w:val="clear" w:color="auto" w:fill="F2F6FC"/>
+          </w:tcPr>
+          <w:p>
+            <w:r>
+              <w:rPr>
+                <w:sz w:val="18"/>
+              </w:rPr>
+              <w:t>app/components 中无</w:t>
+            </w:r>
+          </w:p>
+        </w:tc>
+      </w:tr>
+      <w:tr>
+        <w:tc>
+          <w:tcPr>
+            <w:tcW w:type="dxa" w:w="2880"/>
+          </w:tcPr>
+          <w:p>
+            <w:r>
+              <w:rPr>
+                <w:sz w:val="18"/>
+              </w:rPr>
+              <w:t>null/undefined/NaN in UI</w:t>
+            </w:r>
+          </w:p>
+        </w:tc>
+        <w:tc>
+          <w:tcPr>
+            <w:tcW w:type="dxa" w:w="2880"/>
+          </w:tcPr>
+          <w:p>
+            <w:r>
+              <w:rPr>
+                <w:sz w:val="18"/>
+              </w:rPr>
+              <w:t>✅ 已清零</w:t>
+            </w:r>
+          </w:p>
+        </w:tc>
+        <w:tc>
+          <w:tcPr>
+            <w:tcW w:type="dxa" w:w="2880"/>
+          </w:tcPr>
+          <w:p>
+            <w:r>
+              <w:rPr>
+                <w:sz w:val="18"/>
+              </w:rPr>
+              <w:t>仅 TS 类型注解</w:t>
+            </w:r>
+          </w:p>
+        </w:tc>
+      </w:tr>
+      <w:tr>
+        <w:tc>
+          <w:tcPr>
+            <w:tcW w:type="dxa" w:w="2880"/>
+            <w:shd w:val="clear" w:color="auto" w:fill="F2F6FC"/>
+          </w:tcPr>
+          <w:p>
+            <w:r>
+              <w:rPr>
+                <w:sz w:val="18"/>
+              </w:rPr>
+              <w:t>DATABASE_URL 泄露</w:t>
+            </w:r>
+          </w:p>
+        </w:tc>
+        <w:tc>
+          <w:tcPr>
+            <w:tcW w:type="dxa" w:w="2880"/>
+            <w:shd w:val="clear" w:color="auto" w:fill="F2F6FC"/>
+          </w:tcPr>
+          <w:p>
+            <w:r>
+              <w:rPr>
+                <w:sz w:val="18"/>
+              </w:rPr>
+              <w:t>✅ 无泄露</w:t>
+            </w:r>
+          </w:p>
+        </w:tc>
+        <w:tc>
+          <w:tcPr>
+            <w:tcW w:type="dxa" w:w="2880"/>
+            <w:shd w:val="clear" w:color="auto" w:fill="F2F6FC"/>
+          </w:tcPr>
+          <w:p>
+            <w:r>
+              <w:rPr>
+                <w:sz w:val="18"/>
+              </w:rPr>
+              <w:t>仅 server 端内部引用 process.env</w:t>
+            </w:r>
+          </w:p>
+        </w:tc>
+      </w:tr>
+      <w:tr>
+        <w:tc>
+          <w:tcPr>
+            <w:tcW w:type="dxa" w:w="2880"/>
+          </w:tcPr>
+          <w:p>
+            <w:r>
+              <w:rPr>
+                <w:sz w:val="18"/>
+              </w:rPr>
+              <w:t>散落 hex 色值</w:t>
+            </w:r>
+          </w:p>
+        </w:tc>
+        <w:tc>
+          <w:tcPr>
+            <w:tcW w:type="dxa" w:w="2880"/>
+          </w:tcPr>
+          <w:p>
+            <w:r>
+              <w:rPr>
+                <w:sz w:val="18"/>
+              </w:rPr>
+              <w:t>✅ 无</w:t>
+            </w:r>
+          </w:p>
+        </w:tc>
+        <w:tc>
+          <w:tcPr>
+            <w:tcW w:type="dxa" w:w="2880"/>
+          </w:tcPr>
+          <w:p>
+            <w:r>
+              <w:rPr>
+                <w:sz w:val="18"/>
+              </w:rPr>
+              <w:t>全部使用 CSS 变量</w:t>
+            </w:r>
+          </w:p>
+        </w:tc>
+      </w:tr>
+    </w:tbl>
+    <w:p/>
+    <w:p>
+      <w:pPr>
+        <w:pStyle w:val="Heading1"/>
+      </w:pPr>
+      <w:r>
+        <w:t>八、验收红线确认</w:t>
       </w:r>
     </w:p>
     <w:tbl>
@@ -3093,7 +3791,7 @@
         <w:pStyle w:val="Heading1"/>
       </w:pPr>
       <w:r>
-        <w:t>八、最终结论</w:t>
+        <w:t>九、最终结论</w:t>
       </w:r>
     </w:p>
     <w:tbl>

</xml_diff>